<commit_message>
feat: add counsel-approved legal disclaimer to product surfaces
Adds a single shared LEGAL_DISCLAIMER constant (lib/constants.ts) and
places it on all four surfaces where a user sees or acts on a risk result:

- app/review/ip/page.tsx — end of result section, below redline suggestion
- components/email-capture-banner.tsx — below the save-report form
- app/review/summary/page.tsx — above the back-to-home link
- app/layout.tsx — site-wide footer, under the brand tagline

Wording is fixed by counsel: "Pactora flags issues to discuss with a
lawyer - it's not legal advice. Speak to a qualified lawyer before you
sign." Single constant ensures all surfaces stay in sync.

Also propagates pactora4 updates: disclaimer paragraph in gen_counsel.js
counsel doc, updated disclaimer in tester/PactoraTester.jsx export JSON
and footer, and regenerated Pactora_Counsel_Signoff.docx.

Co-Authored-By: Claude Sonnet 4.6 <noreply@anthropic.com>
</commit_message>
<xml_diff>
--- a/docs/Pactora_Counsel_Signoff.docx
+++ b/docs/Pactora_Counsel_Signoff.docx
@@ -19338,6 +19338,19 @@
           <w:szCs w:val="22"/>
         </w:rPr>
         <w:t xml:space="preserve"/>
+      </w:r>
+    </w:p>
+    <w:p>
+      <w:pPr>
+        <w:spacing w:after="60" w:before="200" w:line="276"/>
+      </w:pPr>
+      <w:r>
+        <w:rPr>
+          <w:color w:val="7C2D2D"/>
+          <w:sz w:val="19"/>
+          <w:szCs w:val="19"/>
+        </w:rPr>
+        <w:t xml:space="preserve">End-user disclaimer (shown in the product): “Pactora flags issues to discuss with a lawyer - it’s not legal advice. Speak to a qualified lawyer before you sign.”</w:t>
       </w:r>
     </w:p>
     <w:p>

</xml_diff>